<commit_message>
FATD (2 paginas, grau/RG auto, sem portaria) + RENE assinaturas + alerta de bloqueio
FATD:
- Grau hierarquico e RG agora sao preenchidos automaticamente do efetivo, no
  lugar certo (militar apurado e participante/Chefe P1). RG puxado da ficha.
- Documento em 2 paginas: a 1a termina no nome do militar apurado (ciente); a
  2a traz Justificativa + Decisao num unico bloco, SEM as caixas/faixas cinza.
- Remove o campo "Portaria" (FATD nao usa); mantem o "Numero" do processo.
- Prazo amarrado em 3 dias uteis apos o ciente/instauracao, mas editavel.

RENE (Joe): linha de assinatura acima de cada uma das 3 assinaturas + mais
espacamento (template docx).

Seguranca: ao bloquear uma conta (5 erros), alerta os admins por PUSH e mostra
no sininho (novo /api/seguranca/alertas, ultimas 24h). Parecer do P/1 ja era
obrigatorio (mantido).

Co-Authored-By: Claude Opus 4.8 <noreply@anthropic.com>
Claude-Session: https://claude.ai/code/session_01VGNJMfaLA4JKnQLxdRRMem
</commit_message>
<xml_diff>
--- a/public/templates/rene-template.docx
+++ b/public/templates/rene-template.docx
@@ -927,7 +927,7 @@
     </w:p>
     <w:p>
       <w:pPr>
-        <w:spacing w:after="200"/>
+        <w:spacing w:after="500"/>
         <w:jc w:val="center"/>
       </w:pPr>
       <w:r>
@@ -943,6 +943,20 @@
     </w:p>
     <w:p>
       <w:pPr>
+        <w:spacing w:before="360" w:after="0"/>
+        <w:jc w:val="center"/>
+      </w:pPr>
+      <w:r>
+        <w:rPr>
+          <w:rFonts w:ascii="Arial" w:cs="Arial" w:eastAsia="Arial" w:hAnsi="Arial"/>
+          <w:sz w:val="20"/>
+          <w:szCs w:val="20"/>
+        </w:rPr>
+        <w:t xml:space="preserve">________________________________________</w:t>
+      </w:r>
+    </w:p>
+    <w:p>
+      <w:pPr>
         <w:spacing w:after="600"/>
         <w:jc w:val="center"/>
       </w:pPr>
@@ -955,6 +969,20 @@
           <w:szCs w:val="20"/>
         </w:rPr>
         <w:t xml:space="preserve">COMANDANTE DA OPERAÇÃO</w:t>
+      </w:r>
+    </w:p>
+    <w:p>
+      <w:pPr>
+        <w:spacing w:before="360" w:after="0"/>
+        <w:jc w:val="center"/>
+      </w:pPr>
+      <w:r>
+        <w:rPr>
+          <w:rFonts w:ascii="Arial" w:cs="Arial" w:eastAsia="Arial" w:hAnsi="Arial"/>
+          <w:sz w:val="20"/>
+          <w:szCs w:val="20"/>
+        </w:rPr>
+        <w:t xml:space="preserve">__________________________________                              __________________________________</w:t>
       </w:r>
     </w:p>
     <w:p>

</xml_diff>

<commit_message>
RENE: tabelas na largura total do texto; assinaturas do rodape nas margens
- Tabelas passam a terminar exatamente na margem do texto (largura util 15398 dxa)
- CHEFE DO P/1 DA UPM (GOV.BR) alinhado a esquerda da margem
- COMANDANTE DA UPM (GOV.BR) alinhado a direita da margem (tab a direita)

Co-Authored-By: Claude Opus 4.8 <noreply@anthropic.com>
Claude-Session: https://claude.ai/code/session_01VGNJMfaLA4JKnQLxdRRMem
</commit_message>
<xml_diff>
--- a/public/templates/rene-template.docx
+++ b/public/templates/rene-template.docx
@@ -99,7 +99,7 @@
     </w:p>
     <w:tbl>
       <w:tblPr>
-        <w:tblW w:type="dxa" w:w="14200"/>
+        <w:tblW w:type="dxa" w:w="15398"/>
         <w:tblBorders>
           <w:top w:val="single" w:color="000000" w:sz="4"/>
           <w:left w:val="single" w:color="000000" w:sz="4"/>
@@ -111,13 +111,13 @@
         <w:tblLayout w:type="fixed"/>
       </w:tblPr>
       <w:tblGrid>
-        <w:gridCol w:w="100"/>
-        <w:gridCol w:w="100"/>
+        <w:gridCol w:w="7699"/>
+        <w:gridCol w:w="7699"/>
       </w:tblGrid>
       <w:tr>
         <w:tc>
           <w:tcPr>
-            <w:tcW w:type="dxa" w:w="14200"/>
+            <w:tcW w:type="dxa" w:w="15398"/>
             <w:gridSpan w:val="2"/>
             <w:tcMar>
               <w:top w:type="dxa" w:w="20"/>
@@ -158,7 +158,7 @@
       <w:tr>
         <w:tc>
           <w:tcPr>
-            <w:tcW w:type="dxa" w:w="14200"/>
+            <w:tcW w:type="dxa" w:w="15398"/>
             <w:gridSpan w:val="2"/>
             <w:tcMar>
               <w:top w:type="dxa" w:w="20"/>
@@ -199,7 +199,7 @@
       <w:tr>
         <w:tc>
           <w:tcPr>
-            <w:tcW w:type="dxa" w:w="14200"/>
+            <w:tcW w:type="dxa" w:w="15398"/>
             <w:gridSpan w:val="2"/>
             <w:tcMar>
               <w:top w:type="dxa" w:w="20"/>
@@ -240,7 +240,7 @@
       <w:tr>
         <w:tc>
           <w:tcPr>
-            <w:tcW w:type="dxa" w:w="7100"/>
+            <w:tcW w:type="dxa" w:w="7699"/>
             <w:tcMar>
               <w:top w:type="dxa" w:w="20"/>
               <w:left w:type="dxa" w:w="40"/>
@@ -278,7 +278,7 @@
         </w:tc>
         <w:tc>
           <w:tcPr>
-            <w:tcW w:type="dxa" w:w="7100"/>
+            <w:tcW w:type="dxa" w:w="7699"/>
             <w:tcMar>
               <w:top w:type="dxa" w:w="20"/>
               <w:left w:type="dxa" w:w="40"/>
@@ -318,7 +318,7 @@
       <w:tr>
         <w:tc>
           <w:tcPr>
-            <w:tcW w:type="dxa" w:w="14200"/>
+            <w:tcW w:type="dxa" w:w="15398"/>
             <w:gridSpan w:val="2"/>
             <w:tcMar>
               <w:top w:type="dxa" w:w="20"/>
@@ -359,7 +359,7 @@
       <w:tr>
         <w:tc>
           <w:tcPr>
-            <w:tcW w:type="dxa" w:w="14200"/>
+            <w:tcW w:type="dxa" w:w="15398"/>
             <w:gridSpan w:val="2"/>
             <w:tcMar>
               <w:top w:type="dxa" w:w="20"/>
@@ -416,7 +416,7 @@
     </w:p>
     <w:tbl>
       <w:tblPr>
-        <w:tblW w:type="dxa" w:w="14200"/>
+        <w:tblW w:type="dxa" w:w="15398"/>
         <w:tblBorders>
           <w:top w:val="single" w:color="000000" w:sz="4"/>
           <w:left w:val="single" w:color="000000" w:sz="4"/>
@@ -428,18 +428,18 @@
         <w:tblLayout w:type="fixed"/>
       </w:tblPr>
       <w:tblGrid>
-        <w:gridCol w:w="961"/>
-        <w:gridCol w:w="3844"/>
-        <w:gridCol w:w="1174"/>
-        <w:gridCol w:w="2029"/>
-        <w:gridCol w:w="1388"/>
-        <w:gridCol w:w="2242"/>
-        <w:gridCol w:w="2562"/>
+        <w:gridCol w:w="1042"/>
+        <w:gridCol w:w="4168"/>
+        <w:gridCol w:w="1273"/>
+        <w:gridCol w:w="2200"/>
+        <w:gridCol w:w="1505"/>
+        <w:gridCol w:w="2431"/>
+        <w:gridCol w:w="2779"/>
       </w:tblGrid>
       <w:tr>
         <w:tc>
           <w:tcPr>
-            <w:tcW w:type="dxa" w:w="14200"/>
+            <w:tcW w:type="dxa" w:w="15398"/>
             <w:gridSpan w:val="7"/>
             <w:shd w:fill="D9D9D9" w:val="clear"/>
             <w:tcMar>
@@ -474,7 +474,7 @@
         </w:trPr>
         <w:tc>
           <w:tcPr>
-            <w:tcW w:type="dxa" w:w="961"/>
+            <w:tcW w:type="dxa" w:w="1042"/>
             <w:shd w:fill="D9D9D9" w:val="clear"/>
             <w:tcMar>
               <w:top w:type="dxa" w:w="20"/>
@@ -503,7 +503,7 @@
         </w:tc>
         <w:tc>
           <w:tcPr>
-            <w:tcW w:type="dxa" w:w="3844"/>
+            <w:tcW w:type="dxa" w:w="4168"/>
             <w:shd w:fill="D9D9D9" w:val="clear"/>
             <w:tcMar>
               <w:top w:type="dxa" w:w="20"/>
@@ -532,7 +532,7 @@
         </w:tc>
         <w:tc>
           <w:tcPr>
-            <w:tcW w:type="dxa" w:w="1174"/>
+            <w:tcW w:type="dxa" w:w="1273"/>
             <w:shd w:fill="D9D9D9" w:val="clear"/>
             <w:tcMar>
               <w:top w:type="dxa" w:w="20"/>
@@ -561,7 +561,7 @@
         </w:tc>
         <w:tc>
           <w:tcPr>
-            <w:tcW w:type="dxa" w:w="2029"/>
+            <w:tcW w:type="dxa" w:w="2200"/>
             <w:shd w:fill="D9D9D9" w:val="clear"/>
             <w:tcMar>
               <w:top w:type="dxa" w:w="20"/>
@@ -590,7 +590,7 @@
         </w:tc>
         <w:tc>
           <w:tcPr>
-            <w:tcW w:type="dxa" w:w="1388"/>
+            <w:tcW w:type="dxa" w:w="1505"/>
             <w:shd w:fill="D9D9D9" w:val="clear"/>
             <w:tcMar>
               <w:top w:type="dxa" w:w="20"/>
@@ -619,7 +619,7 @@
         </w:tc>
         <w:tc>
           <w:tcPr>
-            <w:tcW w:type="dxa" w:w="2242"/>
+            <w:tcW w:type="dxa" w:w="2431"/>
             <w:shd w:fill="D9D9D9" w:val="clear"/>
             <w:tcMar>
               <w:top w:type="dxa" w:w="20"/>
@@ -648,7 +648,7 @@
         </w:tc>
         <w:tc>
           <w:tcPr>
-            <w:tcW w:type="dxa" w:w="2562"/>
+            <w:tcW w:type="dxa" w:w="2779"/>
             <w:shd w:fill="D9D9D9" w:val="clear"/>
             <w:tcMar>
               <w:top w:type="dxa" w:w="20"/>
@@ -680,7 +680,7 @@
       <w:tr>
         <w:tc>
           <w:tcPr>
-            <w:tcW w:type="dxa" w:w="961"/>
+            <w:tcW w:type="dxa" w:w="1042"/>
             <w:tcMar>
               <w:top w:type="dxa" w:w="20"/>
               <w:left w:type="dxa" w:w="40"/>
@@ -708,7 +708,7 @@
         </w:tc>
         <w:tc>
           <w:tcPr>
-            <w:tcW w:type="dxa" w:w="3844"/>
+            <w:tcW w:type="dxa" w:w="4168"/>
             <w:tcMar>
               <w:top w:type="dxa" w:w="20"/>
               <w:left w:type="dxa" w:w="40"/>
@@ -736,7 +736,7 @@
         </w:tc>
         <w:tc>
           <w:tcPr>
-            <w:tcW w:type="dxa" w:w="1174"/>
+            <w:tcW w:type="dxa" w:w="1273"/>
             <w:tcMar>
               <w:top w:type="dxa" w:w="20"/>
               <w:left w:type="dxa" w:w="40"/>
@@ -764,7 +764,7 @@
         </w:tc>
         <w:tc>
           <w:tcPr>
-            <w:tcW w:type="dxa" w:w="2029"/>
+            <w:tcW w:type="dxa" w:w="2200"/>
             <w:tcMar>
               <w:top w:type="dxa" w:w="20"/>
               <w:left w:type="dxa" w:w="40"/>
@@ -792,7 +792,7 @@
         </w:tc>
         <w:tc>
           <w:tcPr>
-            <w:tcW w:type="dxa" w:w="1388"/>
+            <w:tcW w:type="dxa" w:w="1505"/>
             <w:tcMar>
               <w:top w:type="dxa" w:w="20"/>
               <w:left w:type="dxa" w:w="40"/>
@@ -820,7 +820,7 @@
         </w:tc>
         <w:tc>
           <w:tcPr>
-            <w:tcW w:type="dxa" w:w="2242"/>
+            <w:tcW w:type="dxa" w:w="2431"/>
             <w:tcMar>
               <w:top w:type="dxa" w:w="20"/>
               <w:left w:type="dxa" w:w="40"/>
@@ -848,7 +848,7 @@
         </w:tc>
         <w:tc>
           <w:tcPr>
-            <w:tcW w:type="dxa" w:w="2562"/>
+            <w:tcW w:type="dxa" w:w="2779"/>
             <w:tcMar>
               <w:top w:type="dxa" w:w="20"/>
               <w:left w:type="dxa" w:w="40"/>
@@ -973,8 +973,11 @@
     </w:p>
     <w:p>
       <w:pPr>
+        <w:tabs>
+          <w:tab w:val="right" w:pos="15398"/>
+        </w:tabs>
         <w:spacing w:before="360" w:after="0"/>
-        <w:jc w:val="center"/>
+        <w:jc w:val="left"/>
       </w:pPr>
       <w:r>
         <w:rPr>
@@ -982,12 +985,24 @@
           <w:sz w:val="20"/>
           <w:szCs w:val="20"/>
         </w:rPr>
-        <w:t xml:space="preserve">__________________________________                              __________________________________</w:t>
-      </w:r>
-    </w:p>
-    <w:p>
-      <w:pPr>
-        <w:jc w:val="center"/>
+        <w:t xml:space="preserve">__________________________________</w:t>
+      </w:r>
+      <w:r>
+        <w:rPr>
+          <w:rFonts w:ascii="Arial" w:cs="Arial" w:eastAsia="Arial" w:hAnsi="Arial"/>
+          <w:sz w:val="20"/>
+          <w:szCs w:val="20"/>
+        </w:rPr>
+        <w:tab/>
+        <w:t xml:space="preserve">__________________________________</w:t>
+      </w:r>
+    </w:p>
+    <w:p>
+      <w:pPr>
+        <w:tabs>
+          <w:tab w:val="right" w:pos="15398"/>
+        </w:tabs>
+        <w:jc w:val="left"/>
       </w:pPr>
       <w:r>
         <w:rPr>
@@ -1002,19 +1017,12 @@
       <w:r>
         <w:rPr>
           <w:rFonts w:ascii="Arial" w:cs="Arial" w:eastAsia="Arial" w:hAnsi="Arial"/>
-          <w:sz w:val="20"/>
-          <w:szCs w:val="20"/>
-        </w:rPr>
-        <w:t xml:space="preserve">                              </w:t>
-      </w:r>
-      <w:r>
-        <w:rPr>
-          <w:rFonts w:ascii="Arial" w:cs="Arial" w:eastAsia="Arial" w:hAnsi="Arial"/>
           <w:b/>
           <w:bCs/>
           <w:sz w:val="20"/>
           <w:szCs w:val="20"/>
         </w:rPr>
+        <w:tab/>
         <w:t xml:space="preserve">COMANDANTE DA UPM (GOV.BR)</w:t>
       </w:r>
     </w:p>

</xml_diff>